<commit_message>
docs: fill Group2 headers in ten templates
</commit_message>
<xml_diff>
--- a/docs/00_Huong_dan_va_Checklist.docx
+++ b/docs/00_Huong_dan_va_Checklist.docx
@@ -51,7 +51,7 @@
           </w:tcPr>
           <w:p>
             <w:r>
-              <w:t>[P01–P05]</w:t>
+              <w:t>P01</w:t>
             </w:r>
           </w:p>
         </w:tc>
@@ -74,7 +74,7 @@
           </w:tcPr>
           <w:p>
             <w:r>
-              <w:t>[Điền tên cặp đề tài SE–IA]</w:t>
+              <w:t>IT Helpdesk &amp; Service Request Management System × Secure Helpdesk Platform with Access Control and Security Monitoring</w:t>
             </w:r>
           </w:p>
         </w:tc>
@@ -97,7 +97,42 @@
           </w:tcPr>
           <w:p>
             <w:r>
-              <w:t>[Nhóm; họ tên, ngành, vai trò]</w:t>
+              <w:t>Group2</w:t>
+            </w:r>
+          </w:p>
+          <w:p>
+            <w:r>
+              <w:t>Nguyễn Trọng Khiêm | SE192700 | IA → IA | Trưởng nhóm và IA Lead</w:t>
+            </w:r>
+          </w:p>
+          <w:p>
+            <w:r>
+              <w:t>Nguyễn Tăng Minh Khánh | SE193903 | IA → IA | Access Control và AuthZ Testing</w:t>
+            </w:r>
+          </w:p>
+          <w:p>
+            <w:r>
+              <w:t>Huỳnh Minh Hoà | SE193707 | IA → IA | Logging và Security Monitoring</w:t>
+            </w:r>
+          </w:p>
+          <w:p>
+            <w:r>
+              <w:t>Vũ Hồng Nhi | SE182824 | IA → IA | Hardening Upload và Deployment Security</w:t>
+            </w:r>
+          </w:p>
+          <w:p>
+            <w:r>
+              <w:t>Phạm Nguyễn Minh Trí | SE192434 | SE → SE | SE Lead BA và Backend nghiệp vụ</w:t>
+            </w:r>
+          </w:p>
+          <w:p>
+            <w:r>
+              <w:t>Lê Phú Cường | SE200624 | AI → SE | Backend DB Auth và CRUD API</w:t>
+            </w:r>
+          </w:p>
+          <w:p>
+            <w:r>
+              <w:t>Nguyễn Nhật Chính | SE196524 | IS → SE | Frontend ReactJS và Deployment</w:t>
             </w:r>
           </w:p>
         </w:tc>
@@ -120,7 +155,7 @@
           </w:tcPr>
           <w:p>
             <w:r>
-              <w:t>[Họ tên]</w:t>
+              <w:t>Chưa cập nhật</w:t>
             </w:r>
           </w:p>
         </w:tc>
@@ -143,7 +178,7 @@
           </w:tcPr>
           <w:p>
             <w:r>
-              <w:t>[v1.0 / dd-mm-yyyy]</w:t>
+              <w:t>v0.1 / 22-10-2026</w:t>
             </w:r>
           </w:p>
         </w:tc>
@@ -166,7 +201,7 @@
           </w:tcPr>
           <w:p>
             <w:r>
-              <w:t>[Draft / Reviewed / Approved]</w:t>
+              <w:t>Draft</w:t>
             </w:r>
           </w:p>
         </w:tc>
@@ -266,6 +301,9 @@
             <w:shd w:fill="DDEAF3"/>
           </w:tcPr>
           <w:p>
+            <w:pPr>
+              <w:keepNext/>
+            </w:pPr>
             <w:r>
               <w:t>Mã</w:t>
             </w:r>
@@ -277,6 +315,9 @@
             <w:shd w:fill="DDEAF3"/>
           </w:tcPr>
           <w:p>
+            <w:pPr>
+              <w:keepNext/>
+            </w:pPr>
             <w:r>
               <w:t>Tên biểu mẫu</w:t>
             </w:r>
@@ -288,6 +329,9 @@
             <w:shd w:fill="DDEAF3"/>
           </w:tcPr>
           <w:p>
+            <w:pPr>
+              <w:keepNext/>
+            </w:pPr>
             <w:r>
               <w:t>Chủ trì</w:t>
             </w:r>
@@ -299,11 +343,18 @@
             <w:shd w:fill="DDEAF3"/>
           </w:tcPr>
           <w:p>
+            <w:pPr>
+              <w:keepNext/>
+            </w:pPr>
             <w:r>
               <w:t>Thời điểm</w:t>
             </w:r>
           </w:p>
         </w:tc>
+        <w:trPr>
+          <w:tblHeader/>
+          <w:cantSplit/>
+        </w:trPr>
       </w:tr>
       <w:tr>
         <w:tc>
@@ -346,6 +397,9 @@
             </w:r>
           </w:p>
         </w:tc>
+        <w:trPr>
+          <w:cantSplit/>
+        </w:trPr>
       </w:tr>
       <w:tr>
         <w:tc>
@@ -388,6 +442,9 @@
             </w:r>
           </w:p>
         </w:tc>
+        <w:trPr>
+          <w:cantSplit/>
+        </w:trPr>
       </w:tr>
       <w:tr>
         <w:tc>
@@ -430,6 +487,9 @@
             </w:r>
           </w:p>
         </w:tc>
+        <w:trPr>
+          <w:cantSplit/>
+        </w:trPr>
       </w:tr>
       <w:tr>
         <w:tc>
@@ -472,6 +532,9 @@
             </w:r>
           </w:p>
         </w:tc>
+        <w:trPr>
+          <w:cantSplit/>
+        </w:trPr>
       </w:tr>
       <w:tr>
         <w:tc>
@@ -514,6 +577,9 @@
             </w:r>
           </w:p>
         </w:tc>
+        <w:trPr>
+          <w:cantSplit/>
+        </w:trPr>
       </w:tr>
       <w:tr>
         <w:tc>
@@ -556,6 +622,9 @@
             </w:r>
           </w:p>
         </w:tc>
+        <w:trPr>
+          <w:cantSplit/>
+        </w:trPr>
       </w:tr>
       <w:tr>
         <w:tc>
@@ -598,6 +667,9 @@
             </w:r>
           </w:p>
         </w:tc>
+        <w:trPr>
+          <w:cantSplit/>
+        </w:trPr>
       </w:tr>
       <w:tr>
         <w:tc>
@@ -640,6 +712,9 @@
             </w:r>
           </w:p>
         </w:tc>
+        <w:trPr>
+          <w:cantSplit/>
+        </w:trPr>
       </w:tr>
       <w:tr>
         <w:tc>
@@ -682,6 +757,9 @@
             </w:r>
           </w:p>
         </w:tc>
+        <w:trPr>
+          <w:cantSplit/>
+        </w:trPr>
       </w:tr>
     </w:tbl>
     <w:p/>
@@ -712,6 +790,9 @@
             <w:shd w:fill="DDEAF3"/>
           </w:tcPr>
           <w:p>
+            <w:pPr>
+              <w:keepNext/>
+            </w:pPr>
             <w:r>
               <w:t>Loại</w:t>
             </w:r>
@@ -723,6 +804,9 @@
             <w:shd w:fill="DDEAF3"/>
           </w:tcPr>
           <w:p>
+            <w:pPr>
+              <w:keepNext/>
+            </w:pPr>
             <w:r>
               <w:t>Ví dụ</w:t>
             </w:r>
@@ -734,11 +818,18 @@
             <w:shd w:fill="DDEAF3"/>
           </w:tcPr>
           <w:p>
+            <w:pPr>
+              <w:keepNext/>
+            </w:pPr>
             <w:r>
               <w:t>Ý nghĩa</w:t>
             </w:r>
           </w:p>
         </w:tc>
+        <w:trPr>
+          <w:tblHeader/>
+          <w:cantSplit/>
+        </w:trPr>
       </w:tr>
       <w:tr>
         <w:tc>
@@ -771,6 +862,9 @@
             </w:r>
           </w:p>
         </w:tc>
+        <w:trPr>
+          <w:cantSplit/>
+        </w:trPr>
       </w:tr>
       <w:tr>
         <w:tc>
@@ -803,6 +897,9 @@
             </w:r>
           </w:p>
         </w:tc>
+        <w:trPr>
+          <w:cantSplit/>
+        </w:trPr>
       </w:tr>
       <w:tr>
         <w:tc>
@@ -835,6 +932,9 @@
             </w:r>
           </w:p>
         </w:tc>
+        <w:trPr>
+          <w:cantSplit/>
+        </w:trPr>
       </w:tr>
       <w:tr>
         <w:tc>
@@ -867,6 +967,9 @@
             </w:r>
           </w:p>
         </w:tc>
+        <w:trPr>
+          <w:cantSplit/>
+        </w:trPr>
       </w:tr>
       <w:tr>
         <w:tc>
@@ -899,6 +1002,9 @@
             </w:r>
           </w:p>
         </w:tc>
+        <w:trPr>
+          <w:cantSplit/>
+        </w:trPr>
       </w:tr>
       <w:tr>
         <w:tc>
@@ -931,6 +1037,9 @@
             </w:r>
           </w:p>
         </w:tc>
+        <w:trPr>
+          <w:cantSplit/>
+        </w:trPr>
       </w:tr>
     </w:tbl>
     <w:p/>

</xml_diff>